<commit_message>
fix(simperjadin): adjust word header distance and top margin to prevent print cut-off
</commit_message>
<xml_diff>
--- a/public/simperjadin-lengkap.docx
+++ b/public/simperjadin-lengkap.docx
@@ -666,7 +666,7 @@
         <w:sectPr>
           <w:headerReference w:type="default" r:id="rId7"/>
           <w:pgSz w:w="11907" w:h="16839" w:code="9"/>
-          <w:pgMar w:top="360" w:right="720" w:bottom="576" w:left="720" w:header="144" w:footer="0" w:gutter="0"/>
+          <w:pgMar w:top="1080" w:right="720" w:bottom="720" w:left="720" w:header="576" w:footer="0" w:gutter="0"/>
           <w:cols w:space="720"/>
           <w:docGrid w:linePitch="360"/>
         </w:sectPr>
@@ -2900,7 +2900,7 @@
         <w:sectPr>
           <w:headerReference w:type="default" r:id="rId10"/>
           <w:pgSz w:w="11907" w:h="16839" w:code="9"/>
-          <w:pgMar w:top="360" w:right="720" w:bottom="576" w:left="720" w:header="144" w:footer="0" w:gutter="0"/>
+          <w:pgMar w:top="1080" w:right="720" w:bottom="720" w:left="720" w:header="576" w:footer="0" w:gutter="0"/>
           <w:cols w:space="720"/>
           <w:docGrid w:linePitch="360"/>
         </w:sectPr>
@@ -4073,7 +4073,7 @@
     <w:sectPr>
       <w:headerReference w:type="default" r:id="rId11"/>
       <w:pgSz w:w="11907" w:h="16839" w:code="9"/>
-      <w:pgMar w:top="360" w:right="720" w:bottom="576" w:left="720" w:header="144" w:footer="0" w:gutter="0"/>
+      <w:pgMar w:top="1080" w:right="720" w:bottom="720" w:left="720" w:header="576" w:footer="0" w:gutter="0"/>
       <w:cols w:space="720"/>
       <w:docGrid w:linePitch="360"/>
     </w:sectPr>

</xml_diff>

<commit_message>
fix(simperjadin): set word top margin to exact 0.7 inches
</commit_message>
<xml_diff>
--- a/public/simperjadin-lengkap.docx
+++ b/public/simperjadin-lengkap.docx
@@ -666,7 +666,7 @@
         <w:sectPr>
           <w:headerReference w:type="default" r:id="rId7"/>
           <w:pgSz w:w="11907" w:h="16839" w:code="9"/>
-          <w:pgMar w:top="1080" w:right="720" w:bottom="720" w:left="720" w:header="576" w:footer="0" w:gutter="0"/>
+          <w:pgMar w:top="1008" w:right="720" w:bottom="720" w:left="720" w:header="576" w:footer="0" w:gutter="0"/>
           <w:cols w:space="720"/>
           <w:docGrid w:linePitch="360"/>
         </w:sectPr>
@@ -2900,7 +2900,7 @@
         <w:sectPr>
           <w:headerReference w:type="default" r:id="rId10"/>
           <w:pgSz w:w="11907" w:h="16839" w:code="9"/>
-          <w:pgMar w:top="1080" w:right="720" w:bottom="720" w:left="720" w:header="576" w:footer="0" w:gutter="0"/>
+          <w:pgMar w:top="1008" w:right="720" w:bottom="720" w:left="720" w:header="576" w:footer="0" w:gutter="0"/>
           <w:cols w:space="720"/>
           <w:docGrid w:linePitch="360"/>
         </w:sectPr>
@@ -4073,7 +4073,7 @@
     <w:sectPr>
       <w:headerReference w:type="default" r:id="rId11"/>
       <w:pgSz w:w="11907" w:h="16839" w:code="9"/>
-      <w:pgMar w:top="1080" w:right="720" w:bottom="720" w:left="720" w:header="576" w:footer="0" w:gutter="0"/>
+      <w:pgMar w:top="1008" w:right="720" w:bottom="720" w:left="720" w:header="576" w:footer="0" w:gutter="0"/>
       <w:cols w:space="720"/>
       <w:docGrid w:linePitch="360"/>
     </w:sectPr>

</xml_diff>